<commit_message>
complete the pending pltb
</commit_message>
<xml_diff>
--- a/POWER_BI/ASSESSMENTS/Section-C/Assessment-Section-C.docx
+++ b/POWER_BI/ASSESSMENTS/Section-C/Assessment-Section-C.docx
@@ -35,6 +35,7 @@
         <w:rPr>
           <w:b/>
           <w:bCs/>
+          <w:noProof/>
           <w:sz w:val="28"/>
           <w:szCs w:val="28"/>
         </w:rPr>
@@ -91,7 +92,27 @@
           <w:szCs w:val="28"/>
         </w:rPr>
         <w:br/>
-        <w:t>PROBLEM: Give higher discount. Profit are not generating</w:t>
+        <w:t xml:space="preserve">PROBLEM: Give higher discount. Profit </w:t>
+      </w:r>
+      <w:proofErr w:type="gramStart"/>
+      <w:r>
+        <w:rPr>
+          <w:b/>
+          <w:bCs/>
+          <w:sz w:val="28"/>
+          <w:szCs w:val="28"/>
+        </w:rPr>
+        <w:t>are</w:t>
+      </w:r>
+      <w:proofErr w:type="gramEnd"/>
+      <w:r>
+        <w:rPr>
+          <w:b/>
+          <w:bCs/>
+          <w:sz w:val="28"/>
+          <w:szCs w:val="28"/>
+        </w:rPr>
+        <w:t xml:space="preserve"> not generating</w:t>
       </w:r>
     </w:p>
     <w:p>
@@ -130,6 +151,16 @@
         </w:rPr>
         <w:t xml:space="preserve"> </w:t>
       </w:r>
+    </w:p>
+    <w:p>
+      <w:pPr>
+        <w:rPr>
+          <w:b/>
+          <w:bCs/>
+          <w:sz w:val="28"/>
+          <w:szCs w:val="28"/>
+        </w:rPr>
+      </w:pPr>
     </w:p>
     <w:sectPr>
       <w:pgSz w:w="11906" w:h="16838"/>
@@ -744,6 +775,7 @@
   <w:style w:type="character" w:default="1" w:styleId="DefaultParagraphFont">
     <w:name w:val="Default Paragraph Font"/>
     <w:uiPriority w:val="1"/>
+    <w:semiHidden/>
     <w:unhideWhenUsed/>
   </w:style>
   <w:style w:type="table" w:default="1" w:styleId="TableNormal">

</xml_diff>